<commit_message>
chore: sync latest CLM updates including DB backup
</commit_message>
<xml_diff>
--- a/contract agreement/Template Agreement GT_RestrictedFinal - Premium Comodity.docx
+++ b/contract agreement/Template Agreement GT_RestrictedFinal - Premium Comodity.docx
@@ -172,7 +172,6 @@
           <w:bCs/>
         </w:rPr>
       </w:pPr>
-      <w:proofErr w:type="spellStart"/>
       <w:r>
         <w:rPr>
           <w:rFonts w:ascii="Arial" w:hAnsi="Arial"/>
@@ -189,7 +188,6 @@
         </w:rPr>
         <w:t>omor</w:t>
       </w:r>
-      <w:proofErr w:type="spellEnd"/>
       <w:r>
         <w:rPr>
           <w:rFonts w:ascii="Arial" w:hAnsi="Arial"/>
@@ -212,9 +210,7 @@
             <w:listItem w:value="Choose an item."/>
           </w:comboBox>
         </w:sdtPr>
-        <w:sdtEndPr/>
         <w:sdtContent>
-          <w:proofErr w:type="spellStart"/>
           <w:r>
             <w:rPr>
               <w:rFonts w:ascii="Arial" w:hAnsi="Arial"/>
@@ -222,7 +218,6 @@
             </w:rPr>
             <w:t>dikosongkan</w:t>
           </w:r>
-          <w:proofErr w:type="spellEnd"/>
         </w:sdtContent>
       </w:sdt>
     </w:p>
@@ -304,7 +299,6 @@
           </w:placeholder>
           <w:showingPlcHdr/>
         </w:sdtPr>
-        <w:sdtEndPr/>
         <w:sdtContent>
           <w:r>
             <w:rPr>
@@ -491,7 +485,6 @@
           </w:placeholder>
           <w:showingPlcHdr/>
         </w:sdtPr>
-        <w:sdtEndPr/>
         <w:sdtContent>
           <w:r>
             <w:rPr>
@@ -548,7 +541,6 @@
           </w:placeholder>
           <w:showingPlcHdr/>
         </w:sdtPr>
-        <w:sdtEndPr/>
         <w:sdtContent>
           <w:r>
             <w:rPr>
@@ -590,7 +582,6 @@
           </w:placeholder>
           <w:showingPlcHdr/>
         </w:sdtPr>
-        <w:sdtEndPr/>
         <w:sdtContent>
           <w:r>
             <w:rPr>
@@ -624,7 +615,6 @@
           </w:placeholder>
           <w:showingPlcHdr/>
         </w:sdtPr>
-        <w:sdtEndPr/>
         <w:sdtContent>
           <w:r>
             <w:rPr>
@@ -658,7 +648,6 @@
           </w:placeholder>
           <w:showingPlcHdr/>
         </w:sdtPr>
-        <w:sdtEndPr/>
         <w:sdtContent>
           <w:r>
             <w:rPr>
@@ -826,50 +815,9 @@
       <w:r>
         <w:rPr>
           <w:rFonts w:ascii="Arial" w:hAnsi="Arial"/>
-        </w:rPr>
-        <w:t xml:space="preserve">badan </w:t>
-      </w:r>
-      <w:proofErr w:type="spellStart"/>
-      <w:r>
-        <w:rPr>
-          <w:rFonts w:ascii="Arial" w:hAnsi="Arial"/>
-        </w:rPr>
-        <w:t>hukum</w:t>
-      </w:r>
-      <w:proofErr w:type="spellEnd"/>
-      <w:r>
-        <w:rPr>
-          <w:rFonts w:ascii="Arial" w:hAnsi="Arial"/>
-        </w:rPr>
-        <w:t xml:space="preserve"> </w:t>
-      </w:r>
-      <w:proofErr w:type="spellStart"/>
-      <w:r>
-        <w:rPr>
-          <w:rFonts w:ascii="Arial" w:hAnsi="Arial"/>
-        </w:rPr>
-        <w:t>perseroan</w:t>
-      </w:r>
-      <w:proofErr w:type="spellEnd"/>
-      <w:r>
-        <w:rPr>
-          <w:rFonts w:ascii="Arial" w:hAnsi="Arial"/>
-        </w:rPr>
-        <w:t xml:space="preserve"> </w:t>
-      </w:r>
-      <w:proofErr w:type="spellStart"/>
-      <w:r>
-        <w:rPr>
-          <w:rFonts w:ascii="Arial" w:hAnsi="Arial"/>
-        </w:rPr>
-        <w:t>terbatas</w:t>
-      </w:r>
-      <w:proofErr w:type="spellEnd"/>
-      <w:r>
-        <w:rPr>
-          <w:rFonts w:ascii="Arial" w:hAnsi="Arial"/>
-        </w:rPr>
-        <w:t xml:space="preserve"> </w:t>
+          <w:lang w:val="id-ID"/>
+        </w:rPr>
+        <w:t xml:space="preserve">badan hukum perseroan terbatas </w:t>
       </w:r>
       <w:r>
         <w:rPr>
@@ -955,7 +903,6 @@
             <w:listItem w:displayText="choose item" w:value="choose item"/>
           </w:dropDownList>
         </w:sdtPr>
-        <w:sdtEndPr/>
         <w:sdtContent>
           <w:r>
             <w:rPr>
@@ -1780,7 +1727,6 @@
           </w:placeholder>
           <w:showingPlcHdr/>
         </w:sdtPr>
-        <w:sdtEndPr/>
         <w:sdtContent>
           <w:r>
             <w:rPr>
@@ -1829,7 +1775,6 @@
           </w:placeholder>
           <w:showingPlcHdr/>
         </w:sdtPr>
-        <w:sdtEndPr/>
         <w:sdtContent>
           <w:r>
             <w:rPr>
@@ -2649,6 +2594,7 @@
       <w:r>
         <w:rPr>
           <w:rFonts w:ascii="Arial" w:hAnsi="Arial"/>
+          <w:lang w:val="id-ID"/>
         </w:rPr>
         <w:t xml:space="preserve"> </w:t>
       </w:r>
@@ -4673,7 +4619,6 @@
                 <w:listItem w:value="Choose an item."/>
               </w:comboBox>
             </w:sdtPr>
-            <w:sdtEndPr/>
             <w:sdtContent>
               <w:p>
                 <w:pPr>
@@ -4690,17 +4635,8 @@
                     <w:rFonts w:ascii="Arial" w:hAnsi="Arial"/>
                     <w:color w:val="767171" w:themeColor="background2" w:themeShade="80"/>
                   </w:rPr>
-                  <w:t xml:space="preserve">Nama Perusahaan / </w:t>
+                  <w:t>Nama Perusahaan / Petshop</w:t>
                 </w:r>
-                <w:proofErr w:type="spellStart"/>
-                <w:r>
-                  <w:rPr>
-                    <w:rFonts w:ascii="Arial" w:hAnsi="Arial"/>
-                    <w:color w:val="767171" w:themeColor="background2" w:themeShade="80"/>
-                  </w:rPr>
-                  <w:t>Petshop</w:t>
-                </w:r>
-                <w:proofErr w:type="spellEnd"/>
               </w:p>
             </w:sdtContent>
           </w:sdt>
@@ -4802,7 +4738,6 @@
               </w:placeholder>
               <w:showingPlcHdr/>
             </w:sdtPr>
-            <w:sdtEndPr/>
             <w:sdtContent>
               <w:p>
                 <w:pPr>
@@ -4863,7 +4798,6 @@
                 </w:placeholder>
                 <w:showingPlcHdr/>
               </w:sdtPr>
-              <w:sdtEndPr/>
               <w:sdtContent>
                 <w:r>
                   <w:rPr>
@@ -4984,7 +4918,6 @@
           <w:bCs/>
         </w:rPr>
       </w:pPr>
-      <w:proofErr w:type="spellStart"/>
       <w:r>
         <w:rPr>
           <w:rFonts w:ascii="Arial" w:hAnsi="Arial"/>
@@ -5001,7 +4934,6 @@
         </w:rPr>
         <w:t>omor</w:t>
       </w:r>
-      <w:proofErr w:type="spellEnd"/>
       <w:r>
         <w:rPr>
           <w:rFonts w:ascii="Arial" w:hAnsi="Arial"/>
@@ -5025,7 +4957,6 @@
             <w:listItem w:value="Choose an item."/>
           </w:comboBox>
         </w:sdtPr>
-        <w:sdtEndPr/>
         <w:sdtContent>
           <w:r>
             <w:rPr>
@@ -5219,19 +5150,11 @@
                 <w:rFonts w:ascii="Arial" w:hAnsi="Arial"/>
               </w:rPr>
             </w:pPr>
-            <w:proofErr w:type="spellStart"/>
             <w:r>
               <w:rPr>
                 <w:rFonts w:ascii="Arial" w:hAnsi="Arial"/>
               </w:rPr>
-              <w:t>Addreses</w:t>
-            </w:r>
-            <w:proofErr w:type="spellEnd"/>
-            <w:r>
-              <w:rPr>
-                <w:rFonts w:ascii="Arial" w:hAnsi="Arial"/>
-              </w:rPr>
-              <w:t xml:space="preserve"> of Second Party Place</w:t>
+              <w:t>Addreses of Second Party Place</w:t>
             </w:r>
           </w:p>
         </w:tc>
@@ -5376,21 +5299,7 @@
               <w:rPr>
                 <w:rFonts w:ascii="Arial" w:hAnsi="Arial"/>
               </w:rPr>
-              <w:t>Quarter (</w:t>
-            </w:r>
-            <w:proofErr w:type="spellStart"/>
-            <w:r>
-              <w:rPr>
-                <w:rFonts w:ascii="Arial" w:hAnsi="Arial"/>
-              </w:rPr>
-              <w:t>Triwulan</w:t>
-            </w:r>
-            <w:proofErr w:type="spellEnd"/>
-            <w:r>
-              <w:rPr>
-                <w:rFonts w:ascii="Arial" w:hAnsi="Arial"/>
-              </w:rPr>
-              <w:t xml:space="preserve">) </w:t>
+              <w:t xml:space="preserve">Quarter (Triwulan) </w:t>
             </w:r>
             <w:r>
               <w:rPr>
@@ -5402,21 +5311,7 @@
               <w:rPr>
                 <w:rFonts w:ascii="Arial" w:hAnsi="Arial"/>
               </w:rPr>
-              <w:t xml:space="preserve"> Yearly (</w:t>
-            </w:r>
-            <w:proofErr w:type="spellStart"/>
-            <w:r>
-              <w:rPr>
-                <w:rFonts w:ascii="Arial" w:hAnsi="Arial"/>
-              </w:rPr>
-              <w:t>Tahunan</w:t>
-            </w:r>
-            <w:proofErr w:type="spellEnd"/>
-            <w:r>
-              <w:rPr>
-                <w:rFonts w:ascii="Arial" w:hAnsi="Arial"/>
-              </w:rPr>
-              <w:t>):</w:t>
+              <w:t xml:space="preserve"> Yearly (Tahunan):</w:t>
             </w:r>
           </w:p>
           <w:p>
@@ -5428,33 +5323,11 @@
                 <w:rFonts w:ascii="Arial" w:hAnsi="Arial"/>
               </w:rPr>
             </w:pPr>
-            <w:proofErr w:type="spellStart"/>
             <w:r>
               <w:rPr>
                 <w:rFonts w:ascii="Arial" w:hAnsi="Arial"/>
               </w:rPr>
-              <w:t>SmartHeart</w:t>
-            </w:r>
-            <w:proofErr w:type="spellEnd"/>
-            <w:r>
-              <w:rPr>
-                <w:rFonts w:ascii="Arial" w:hAnsi="Arial"/>
-              </w:rPr>
-              <w:t xml:space="preserve">, Smart Heart Gold, </w:t>
-            </w:r>
-            <w:proofErr w:type="spellStart"/>
-            <w:r>
-              <w:rPr>
-                <w:rFonts w:ascii="Arial" w:hAnsi="Arial"/>
-              </w:rPr>
-              <w:t>Me-O</w:t>
-            </w:r>
-            <w:proofErr w:type="spellEnd"/>
-            <w:r>
-              <w:rPr>
-                <w:rFonts w:ascii="Arial" w:hAnsi="Arial"/>
-              </w:rPr>
-              <w:t xml:space="preserve"> Gold</w:t>
+              <w:t>SmartHeart, Smart Heart Gold, Me-O Gold</w:t>
             </w:r>
           </w:p>
         </w:tc>
@@ -5571,7 +5444,6 @@
           <w:bCs/>
         </w:rPr>
       </w:pPr>
-      <w:proofErr w:type="spellStart"/>
       <w:r>
         <w:rPr>
           <w:rFonts w:ascii="Arial" w:hAnsi="Arial"/>
@@ -5588,7 +5460,6 @@
         </w:rPr>
         <w:t>omor</w:t>
       </w:r>
-      <w:proofErr w:type="spellEnd"/>
       <w:r>
         <w:rPr>
           <w:rFonts w:ascii="Arial" w:hAnsi="Arial"/>
@@ -5611,9 +5482,7 @@
             <w:listItem w:value="Choose an item."/>
           </w:comboBox>
         </w:sdtPr>
-        <w:sdtEndPr/>
         <w:sdtContent>
-          <w:proofErr w:type="spellStart"/>
           <w:r>
             <w:rPr>
               <w:rFonts w:ascii="Arial" w:hAnsi="Arial"/>
@@ -5621,7 +5490,6 @@
             </w:rPr>
             <w:t>dikosongkan</w:t>
           </w:r>
-          <w:proofErr w:type="spellEnd"/>
         </w:sdtContent>
       </w:sdt>
     </w:p>
@@ -5716,6 +5584,7 @@
                       <w:rPr>
                         <w:rFonts w:ascii="Arial" w:hAnsi="Arial"/>
                         <w:color w:val="767171" w:themeColor="background2" w:themeShade="80"/>
+                        <w:lang w:val="it-IT"/>
                       </w:rPr>
                       <w:t>(</w:t>
                     </w:r>
@@ -5723,61 +5592,15 @@
                       <w:rPr>
                         <w:rFonts w:ascii="Arial" w:hAnsi="Arial"/>
                         <w:color w:val="767171" w:themeColor="background2" w:themeShade="80"/>
+                        <w:lang w:val="it-IT"/>
                       </w:rPr>
-                      <w:t xml:space="preserve">Harap </w:t>
-                    </w:r>
-                    <w:proofErr w:type="spellStart"/>
-                    <w:r>
-                      <w:rPr>
-                        <w:rFonts w:ascii="Arial" w:hAnsi="Arial"/>
-                        <w:color w:val="767171" w:themeColor="background2" w:themeShade="80"/>
-                      </w:rPr>
-                      <w:t>dilengkapi</w:t>
-                    </w:r>
-                    <w:proofErr w:type="spellEnd"/>
-                    <w:r>
-                      <w:rPr>
-                        <w:rFonts w:ascii="Arial" w:hAnsi="Arial"/>
-                        <w:color w:val="767171" w:themeColor="background2" w:themeShade="80"/>
-                      </w:rPr>
-                      <w:t xml:space="preserve"> </w:t>
-                    </w:r>
-                    <w:proofErr w:type="spellStart"/>
-                    <w:r>
-                      <w:rPr>
-                        <w:rFonts w:ascii="Arial" w:hAnsi="Arial"/>
-                        <w:color w:val="767171" w:themeColor="background2" w:themeShade="80"/>
-                      </w:rPr>
-                      <w:t>dengan</w:t>
-                    </w:r>
-                    <w:proofErr w:type="spellEnd"/>
-                    <w:r>
-                      <w:rPr>
-                        <w:rFonts w:ascii="Arial" w:hAnsi="Arial"/>
-                        <w:color w:val="767171" w:themeColor="background2" w:themeShade="80"/>
-                      </w:rPr>
-                      <w:t xml:space="preserve"> </w:t>
-                    </w:r>
-                    <w:proofErr w:type="spellStart"/>
-                    <w:r>
-                      <w:rPr>
-                        <w:rFonts w:ascii="Arial" w:hAnsi="Arial"/>
-                        <w:color w:val="767171" w:themeColor="background2" w:themeShade="80"/>
-                      </w:rPr>
-                      <w:t>bulan</w:t>
-                    </w:r>
-                    <w:proofErr w:type="spellEnd"/>
-                    <w:r>
-                      <w:rPr>
-                        <w:rFonts w:ascii="Arial" w:hAnsi="Arial"/>
-                        <w:color w:val="767171" w:themeColor="background2" w:themeShade="80"/>
-                      </w:rPr>
-                      <w:t xml:space="preserve"> quartal</w:t>
+                      <w:t>Harap dilengkapi dengan bulan quartal</w:t>
                     </w:r>
                     <w:r>
                       <w:rPr>
                         <w:rFonts w:ascii="Arial" w:hAnsi="Arial"/>
                         <w:color w:val="767171" w:themeColor="background2" w:themeShade="80"/>
+                        <w:lang w:val="it-IT"/>
                       </w:rPr>
                       <w:t>)</w:t>
                     </w:r>
@@ -5800,7 +5623,6 @@
               <w:docPart w:val="18F320C004374A9189158780030446D4"/>
             </w:placeholder>
           </w:sdtPr>
-          <w:sdtEndPr/>
           <w:sdtContent>
             <w:tc>
               <w:tcPr>
@@ -5832,7 +5654,6 @@
                       <w:docPart w:val="8A5BCFD1CE5A4D7F8CAE23B036AD9274"/>
                     </w:placeholder>
                   </w:sdtPr>
-                  <w:sdtEndPr/>
                   <w:sdtContent>
                     <w:sdt>
                       <w:sdtPr>
@@ -5847,39 +5668,13 @@
                           <w:docPart w:val="F41CCA786C734E738E4155A3AF27A9A3"/>
                         </w:placeholder>
                       </w:sdtPr>
-                      <w:sdtEndPr/>
                       <w:sdtContent>
-                        <w:proofErr w:type="spellStart"/>
                         <w:r>
                           <w:rPr>
                             <w:rFonts w:ascii="Arial" w:hAnsi="Arial"/>
                             <w:color w:val="767171" w:themeColor="background2" w:themeShade="80"/>
                           </w:rPr>
-                          <w:t>Diisikan</w:t>
-                        </w:r>
-                        <w:proofErr w:type="spellEnd"/>
-                        <w:r>
-                          <w:rPr>
-                            <w:rFonts w:ascii="Arial" w:hAnsi="Arial"/>
-                            <w:color w:val="767171" w:themeColor="background2" w:themeShade="80"/>
-                          </w:rPr>
-                          <w:t xml:space="preserve"> </w:t>
-                        </w:r>
-                        <w:proofErr w:type="spellStart"/>
-                        <w:r>
-                          <w:rPr>
-                            <w:rFonts w:ascii="Arial" w:hAnsi="Arial"/>
-                            <w:color w:val="767171" w:themeColor="background2" w:themeShade="80"/>
-                          </w:rPr>
-                          <w:t>dengan</w:t>
-                        </w:r>
-                        <w:proofErr w:type="spellEnd"/>
-                        <w:r>
-                          <w:rPr>
-                            <w:rFonts w:ascii="Arial" w:hAnsi="Arial"/>
-                            <w:color w:val="767171" w:themeColor="background2" w:themeShade="80"/>
-                          </w:rPr>
-                          <w:t xml:space="preserve"> sales target</w:t>
+                          <w:t>Diisikan dengan sales target</w:t>
                         </w:r>
                       </w:sdtContent>
                     </w:sdt>
@@ -5929,7 +5724,6 @@
                   <w:docPart w:val="81E5CFFC91CE4FA08742CFAF0E44EF45"/>
                 </w:placeholder>
               </w:sdtPr>
-              <w:sdtEndPr/>
               <w:sdtContent>
                 <w:sdt>
                   <w:sdtPr>
@@ -5944,7 +5738,6 @@
                       <w:docPart w:val="3D3F8E8BC9C84DADA4C47D396D413FF4"/>
                     </w:placeholder>
                   </w:sdtPr>
-                  <w:sdtEndPr/>
                   <w:sdtContent>
                     <w:sdt>
                       <w:sdtPr>
@@ -5978,55 +5771,7 @@
                             <w:rFonts w:ascii="Arial" w:hAnsi="Arial"/>
                             <w:color w:val="767171" w:themeColor="background2" w:themeShade="80"/>
                           </w:rPr>
-                          <w:t xml:space="preserve">Harap </w:t>
-                        </w:r>
-                        <w:proofErr w:type="spellStart"/>
-                        <w:r>
-                          <w:rPr>
-                            <w:rFonts w:ascii="Arial" w:hAnsi="Arial"/>
-                            <w:color w:val="767171" w:themeColor="background2" w:themeShade="80"/>
-                          </w:rPr>
-                          <w:t>dilengkapi</w:t>
-                        </w:r>
-                        <w:proofErr w:type="spellEnd"/>
-                        <w:r>
-                          <w:rPr>
-                            <w:rFonts w:ascii="Arial" w:hAnsi="Arial"/>
-                            <w:color w:val="767171" w:themeColor="background2" w:themeShade="80"/>
-                          </w:rPr>
-                          <w:t xml:space="preserve"> </w:t>
-                        </w:r>
-                        <w:proofErr w:type="spellStart"/>
-                        <w:r>
-                          <w:rPr>
-                            <w:rFonts w:ascii="Arial" w:hAnsi="Arial"/>
-                            <w:color w:val="767171" w:themeColor="background2" w:themeShade="80"/>
-                          </w:rPr>
-                          <w:t>dengan</w:t>
-                        </w:r>
-                        <w:proofErr w:type="spellEnd"/>
-                        <w:r>
-                          <w:rPr>
-                            <w:rFonts w:ascii="Arial" w:hAnsi="Arial"/>
-                            <w:color w:val="767171" w:themeColor="background2" w:themeShade="80"/>
-                          </w:rPr>
-                          <w:t xml:space="preserve"> </w:t>
-                        </w:r>
-                        <w:proofErr w:type="spellStart"/>
-                        <w:r>
-                          <w:rPr>
-                            <w:rFonts w:ascii="Arial" w:hAnsi="Arial"/>
-                            <w:color w:val="767171" w:themeColor="background2" w:themeShade="80"/>
-                          </w:rPr>
-                          <w:t>bulan</w:t>
-                        </w:r>
-                        <w:proofErr w:type="spellEnd"/>
-                        <w:r>
-                          <w:rPr>
-                            <w:rFonts w:ascii="Arial" w:hAnsi="Arial"/>
-                            <w:color w:val="767171" w:themeColor="background2" w:themeShade="80"/>
-                          </w:rPr>
-                          <w:t xml:space="preserve"> quartal</w:t>
+                          <w:t>Harap dilengkapi dengan bulan quartal</w:t>
                         </w:r>
                         <w:r>
                           <w:rPr>
@@ -6056,7 +5801,6 @@
               <w:docPart w:val="521AE6B41E2C4E32B4AB8FF884C42FBB"/>
             </w:placeholder>
           </w:sdtPr>
-          <w:sdtEndPr/>
           <w:sdtContent>
             <w:tc>
               <w:tcPr>
@@ -6088,7 +5832,6 @@
                       <w:docPart w:val="A38C1EAE1F74479BBEF5306A707260FD"/>
                     </w:placeholder>
                   </w:sdtPr>
-                  <w:sdtEndPr/>
                   <w:sdtContent>
                     <w:sdt>
                       <w:sdtPr>
@@ -6103,39 +5846,13 @@
                           <w:docPart w:val="23D18E1E3E8243589B53329B624DA59F"/>
                         </w:placeholder>
                       </w:sdtPr>
-                      <w:sdtEndPr/>
                       <w:sdtContent>
-                        <w:proofErr w:type="spellStart"/>
                         <w:r>
                           <w:rPr>
                             <w:rFonts w:ascii="Arial" w:hAnsi="Arial"/>
                             <w:color w:val="767171" w:themeColor="background2" w:themeShade="80"/>
                           </w:rPr>
-                          <w:t>Diisikan</w:t>
-                        </w:r>
-                        <w:proofErr w:type="spellEnd"/>
-                        <w:r>
-                          <w:rPr>
-                            <w:rFonts w:ascii="Arial" w:hAnsi="Arial"/>
-                            <w:color w:val="767171" w:themeColor="background2" w:themeShade="80"/>
-                          </w:rPr>
-                          <w:t xml:space="preserve"> </w:t>
-                        </w:r>
-                        <w:proofErr w:type="spellStart"/>
-                        <w:r>
-                          <w:rPr>
-                            <w:rFonts w:ascii="Arial" w:hAnsi="Arial"/>
-                            <w:color w:val="767171" w:themeColor="background2" w:themeShade="80"/>
-                          </w:rPr>
-                          <w:t>dengan</w:t>
-                        </w:r>
-                        <w:proofErr w:type="spellEnd"/>
-                        <w:r>
-                          <w:rPr>
-                            <w:rFonts w:ascii="Arial" w:hAnsi="Arial"/>
-                            <w:color w:val="767171" w:themeColor="background2" w:themeShade="80"/>
-                          </w:rPr>
-                          <w:t xml:space="preserve"> sales target</w:t>
+                          <w:t>Diisikan dengan sales target</w:t>
                         </w:r>
                       </w:sdtContent>
                     </w:sdt>
@@ -6185,7 +5902,6 @@
                   <w:docPart w:val="041E36E3B8D8453DA0C1D970C6169A52"/>
                 </w:placeholder>
               </w:sdtPr>
-              <w:sdtEndPr/>
               <w:sdtContent>
                 <w:sdt>
                   <w:sdtPr>
@@ -6200,7 +5916,6 @@
                       <w:docPart w:val="EBCD31105C0A4BB3BD988C6FC0B2CA2D"/>
                     </w:placeholder>
                   </w:sdtPr>
-                  <w:sdtEndPr/>
                   <w:sdtContent>
                     <w:sdt>
                       <w:sdtPr>
@@ -6234,55 +5949,7 @@
                             <w:rFonts w:ascii="Arial" w:hAnsi="Arial"/>
                             <w:color w:val="767171" w:themeColor="background2" w:themeShade="80"/>
                           </w:rPr>
-                          <w:t xml:space="preserve">Harap </w:t>
-                        </w:r>
-                        <w:proofErr w:type="spellStart"/>
-                        <w:r>
-                          <w:rPr>
-                            <w:rFonts w:ascii="Arial" w:hAnsi="Arial"/>
-                            <w:color w:val="767171" w:themeColor="background2" w:themeShade="80"/>
-                          </w:rPr>
-                          <w:t>dilengkapi</w:t>
-                        </w:r>
-                        <w:proofErr w:type="spellEnd"/>
-                        <w:r>
-                          <w:rPr>
-                            <w:rFonts w:ascii="Arial" w:hAnsi="Arial"/>
-                            <w:color w:val="767171" w:themeColor="background2" w:themeShade="80"/>
-                          </w:rPr>
-                          <w:t xml:space="preserve"> </w:t>
-                        </w:r>
-                        <w:proofErr w:type="spellStart"/>
-                        <w:r>
-                          <w:rPr>
-                            <w:rFonts w:ascii="Arial" w:hAnsi="Arial"/>
-                            <w:color w:val="767171" w:themeColor="background2" w:themeShade="80"/>
-                          </w:rPr>
-                          <w:t>dengan</w:t>
-                        </w:r>
-                        <w:proofErr w:type="spellEnd"/>
-                        <w:r>
-                          <w:rPr>
-                            <w:rFonts w:ascii="Arial" w:hAnsi="Arial"/>
-                            <w:color w:val="767171" w:themeColor="background2" w:themeShade="80"/>
-                          </w:rPr>
-                          <w:t xml:space="preserve"> </w:t>
-                        </w:r>
-                        <w:proofErr w:type="spellStart"/>
-                        <w:r>
-                          <w:rPr>
-                            <w:rFonts w:ascii="Arial" w:hAnsi="Arial"/>
-                            <w:color w:val="767171" w:themeColor="background2" w:themeShade="80"/>
-                          </w:rPr>
-                          <w:t>bulan</w:t>
-                        </w:r>
-                        <w:proofErr w:type="spellEnd"/>
-                        <w:r>
-                          <w:rPr>
-                            <w:rFonts w:ascii="Arial" w:hAnsi="Arial"/>
-                            <w:color w:val="767171" w:themeColor="background2" w:themeShade="80"/>
-                          </w:rPr>
-                          <w:t xml:space="preserve"> quartal</w:t>
+                          <w:t>Harap dilengkapi dengan bulan quartal</w:t>
                         </w:r>
                         <w:r>
                           <w:rPr>
@@ -6312,7 +5979,6 @@
               <w:docPart w:val="C75EA6F91D5B4A7890EADB16A16CA13A"/>
             </w:placeholder>
           </w:sdtPr>
-          <w:sdtEndPr/>
           <w:sdtContent>
             <w:tc>
               <w:tcPr>
@@ -6344,7 +6010,6 @@
                       <w:docPart w:val="2A4BBAF0E3E84A8BA85F9AB5E31BAF05"/>
                     </w:placeholder>
                   </w:sdtPr>
-                  <w:sdtEndPr/>
                   <w:sdtContent>
                     <w:sdt>
                       <w:sdtPr>
@@ -6359,39 +6024,13 @@
                           <w:docPart w:val="27F271AB68D043F88088C10D5E6416DD"/>
                         </w:placeholder>
                       </w:sdtPr>
-                      <w:sdtEndPr/>
                       <w:sdtContent>
-                        <w:proofErr w:type="spellStart"/>
                         <w:r>
                           <w:rPr>
                             <w:rFonts w:ascii="Arial" w:hAnsi="Arial"/>
                             <w:color w:val="767171" w:themeColor="background2" w:themeShade="80"/>
                           </w:rPr>
-                          <w:t>Diisikan</w:t>
-                        </w:r>
-                        <w:proofErr w:type="spellEnd"/>
-                        <w:r>
-                          <w:rPr>
-                            <w:rFonts w:ascii="Arial" w:hAnsi="Arial"/>
-                            <w:color w:val="767171" w:themeColor="background2" w:themeShade="80"/>
-                          </w:rPr>
-                          <w:t xml:space="preserve"> </w:t>
-                        </w:r>
-                        <w:proofErr w:type="spellStart"/>
-                        <w:r>
-                          <w:rPr>
-                            <w:rFonts w:ascii="Arial" w:hAnsi="Arial"/>
-                            <w:color w:val="767171" w:themeColor="background2" w:themeShade="80"/>
-                          </w:rPr>
-                          <w:t>dengan</w:t>
-                        </w:r>
-                        <w:proofErr w:type="spellEnd"/>
-                        <w:r>
-                          <w:rPr>
-                            <w:rFonts w:ascii="Arial" w:hAnsi="Arial"/>
-                            <w:color w:val="767171" w:themeColor="background2" w:themeShade="80"/>
-                          </w:rPr>
-                          <w:t xml:space="preserve"> sales target</w:t>
+                          <w:t>Diisikan dengan sales target</w:t>
                         </w:r>
                       </w:sdtContent>
                     </w:sdt>
@@ -6441,7 +6080,6 @@
                   <w:docPart w:val="58D082F99ADC4A6B96F056D464076E28"/>
                 </w:placeholder>
               </w:sdtPr>
-              <w:sdtEndPr/>
               <w:sdtContent>
                 <w:sdt>
                   <w:sdtPr>
@@ -6456,7 +6094,6 @@
                       <w:docPart w:val="C26E02CE90184758B0E4244E1601268A"/>
                     </w:placeholder>
                   </w:sdtPr>
-                  <w:sdtEndPr/>
                   <w:sdtContent>
                     <w:sdt>
                       <w:sdtPr>
@@ -6490,55 +6127,7 @@
                             <w:rFonts w:ascii="Arial" w:hAnsi="Arial"/>
                             <w:color w:val="767171" w:themeColor="background2" w:themeShade="80"/>
                           </w:rPr>
-                          <w:t xml:space="preserve">Harap </w:t>
-                        </w:r>
-                        <w:proofErr w:type="spellStart"/>
-                        <w:r>
-                          <w:rPr>
-                            <w:rFonts w:ascii="Arial" w:hAnsi="Arial"/>
-                            <w:color w:val="767171" w:themeColor="background2" w:themeShade="80"/>
-                          </w:rPr>
-                          <w:t>dilengkapi</w:t>
-                        </w:r>
-                        <w:proofErr w:type="spellEnd"/>
-                        <w:r>
-                          <w:rPr>
-                            <w:rFonts w:ascii="Arial" w:hAnsi="Arial"/>
-                            <w:color w:val="767171" w:themeColor="background2" w:themeShade="80"/>
-                          </w:rPr>
-                          <w:t xml:space="preserve"> </w:t>
-                        </w:r>
-                        <w:proofErr w:type="spellStart"/>
-                        <w:r>
-                          <w:rPr>
-                            <w:rFonts w:ascii="Arial" w:hAnsi="Arial"/>
-                            <w:color w:val="767171" w:themeColor="background2" w:themeShade="80"/>
-                          </w:rPr>
-                          <w:t>dengan</w:t>
-                        </w:r>
-                        <w:proofErr w:type="spellEnd"/>
-                        <w:r>
-                          <w:rPr>
-                            <w:rFonts w:ascii="Arial" w:hAnsi="Arial"/>
-                            <w:color w:val="767171" w:themeColor="background2" w:themeShade="80"/>
-                          </w:rPr>
-                          <w:t xml:space="preserve"> </w:t>
-                        </w:r>
-                        <w:proofErr w:type="spellStart"/>
-                        <w:r>
-                          <w:rPr>
-                            <w:rFonts w:ascii="Arial" w:hAnsi="Arial"/>
-                            <w:color w:val="767171" w:themeColor="background2" w:themeShade="80"/>
-                          </w:rPr>
-                          <w:t>bulan</w:t>
-                        </w:r>
-                        <w:proofErr w:type="spellEnd"/>
-                        <w:r>
-                          <w:rPr>
-                            <w:rFonts w:ascii="Arial" w:hAnsi="Arial"/>
-                            <w:color w:val="767171" w:themeColor="background2" w:themeShade="80"/>
-                          </w:rPr>
-                          <w:t xml:space="preserve"> quartal</w:t>
+                          <w:t>Harap dilengkapi dengan bulan quartal</w:t>
                         </w:r>
                         <w:r>
                           <w:rPr>
@@ -6568,7 +6157,6 @@
               <w:docPart w:val="88E024EDD9A1420A8D2232976A90773D"/>
             </w:placeholder>
           </w:sdtPr>
-          <w:sdtEndPr/>
           <w:sdtContent>
             <w:tc>
               <w:tcPr>
@@ -6600,7 +6188,6 @@
                       <w:docPart w:val="1C9523F03FC142CF9570FB87F3F06A84"/>
                     </w:placeholder>
                   </w:sdtPr>
-                  <w:sdtEndPr/>
                   <w:sdtContent>
                     <w:sdt>
                       <w:sdtPr>
@@ -6615,39 +6202,13 @@
                           <w:docPart w:val="33DBC78E143644E981BD1BA751F16CED"/>
                         </w:placeholder>
                       </w:sdtPr>
-                      <w:sdtEndPr/>
                       <w:sdtContent>
-                        <w:proofErr w:type="spellStart"/>
                         <w:r>
                           <w:rPr>
                             <w:rFonts w:ascii="Arial" w:hAnsi="Arial"/>
                             <w:color w:val="767171" w:themeColor="background2" w:themeShade="80"/>
                           </w:rPr>
-                          <w:t>Diisikan</w:t>
-                        </w:r>
-                        <w:proofErr w:type="spellEnd"/>
-                        <w:r>
-                          <w:rPr>
-                            <w:rFonts w:ascii="Arial" w:hAnsi="Arial"/>
-                            <w:color w:val="767171" w:themeColor="background2" w:themeShade="80"/>
-                          </w:rPr>
-                          <w:t xml:space="preserve"> </w:t>
-                        </w:r>
-                        <w:proofErr w:type="spellStart"/>
-                        <w:r>
-                          <w:rPr>
-                            <w:rFonts w:ascii="Arial" w:hAnsi="Arial"/>
-                            <w:color w:val="767171" w:themeColor="background2" w:themeShade="80"/>
-                          </w:rPr>
-                          <w:t>dengan</w:t>
-                        </w:r>
-                        <w:proofErr w:type="spellEnd"/>
-                        <w:r>
-                          <w:rPr>
-                            <w:rFonts w:ascii="Arial" w:hAnsi="Arial"/>
-                            <w:color w:val="767171" w:themeColor="background2" w:themeShade="80"/>
-                          </w:rPr>
-                          <w:t xml:space="preserve"> sales target</w:t>
+                          <w:t>Diisikan dengan sales target</w:t>
                         </w:r>
                       </w:sdtContent>
                     </w:sdt>
@@ -6704,7 +6265,6 @@
               <w:docPart w:val="CFA8B9527F024D77A5FECA09FDEEE104"/>
             </w:placeholder>
           </w:sdtPr>
-          <w:sdtEndPr/>
           <w:sdtContent>
             <w:tc>
               <w:tcPr>
@@ -6736,7 +6296,6 @@
                       <w:docPart w:val="62A1323802764F668361B558D419D56F"/>
                     </w:placeholder>
                   </w:sdtPr>
-                  <w:sdtEndPr/>
                   <w:sdtContent>
                     <w:sdt>
                       <w:sdtPr>
@@ -6752,7 +6311,6 @@
                         </w:placeholder>
                         <w:showingPlcHdr/>
                       </w:sdtPr>
-                      <w:sdtEndPr/>
                       <w:sdtContent>
                         <w:r>
                           <w:rPr>
@@ -6840,7 +6398,6 @@
                 </w:placeholder>
                 <w:showingPlcHdr/>
               </w:sdtPr>
-              <w:sdtEndPr/>
               <w:sdtContent>
                 <w:r>
                   <w:rPr>
@@ -6890,7 +6447,6 @@
                   <w:docPart w:val="26A820D6032F44649368C57489AA68D5"/>
                 </w:placeholder>
               </w:sdtPr>
-              <w:sdtEndPr/>
               <w:sdtContent>
                 <w:sdt>
                   <w:sdtPr>
@@ -6906,7 +6462,6 @@
                     </w:placeholder>
                     <w:showingPlcHdr/>
                   </w:sdtPr>
-                  <w:sdtEndPr/>
                   <w:sdtContent>
                     <w:r>
                       <w:rPr>
@@ -7058,25 +6613,7 @@
           <w:b/>
           <w:bCs/>
         </w:rPr>
-        <w:t>/</w:t>
-      </w:r>
-      <w:proofErr w:type="spellStart"/>
-      <w:r>
-        <w:rPr>
-          <w:rFonts w:ascii="Arial" w:hAnsi="Arial"/>
-          <w:b/>
-          <w:bCs/>
-        </w:rPr>
-        <w:t>Insentif</w:t>
-      </w:r>
-      <w:proofErr w:type="spellEnd"/>
-      <w:r>
-        <w:rPr>
-          <w:rFonts w:ascii="Arial" w:hAnsi="Arial"/>
-          <w:b/>
-          <w:bCs/>
-        </w:rPr>
-        <w:t xml:space="preserve"> Scheme</w:t>
+        <w:t>/Insentif Scheme</w:t>
       </w:r>
     </w:p>
     <w:p>
@@ -7169,7 +6706,6 @@
               </w:rPr>
               <w:t>Desc</w:t>
             </w:r>
-            <w:proofErr w:type="spellStart"/>
             <w:r>
               <w:rPr>
                 <w:rFonts w:ascii="Arial" w:hAnsi="Arial"/>
@@ -7179,7 +6715,6 @@
               </w:rPr>
               <w:t>ription</w:t>
             </w:r>
-            <w:proofErr w:type="spellEnd"/>
           </w:p>
         </w:tc>
         <w:tc>
@@ -9114,7 +8649,6 @@
         <w:docPartUnique/>
       </w:docPartObj>
     </w:sdtPr>
-    <w:sdtEndPr/>
     <w:sdtContent>
       <w:sdt>
         <w:sdtPr>
@@ -9128,7 +8662,6 @@
             <w:docPartUnique/>
           </w:docPartObj>
         </w:sdtPr>
-        <w:sdtEndPr/>
         <w:sdtContent>
           <w:p>
             <w:pPr>
@@ -9216,7 +8749,6 @@
               </w:rPr>
               <w:t xml:space="preserve"> </w:t>
             </w:r>
-            <w:proofErr w:type="spellStart"/>
             <w:r>
               <w:rPr>
                 <w:sz w:val="18"/>
@@ -9224,7 +8756,6 @@
               </w:rPr>
               <w:t>dari</w:t>
             </w:r>
-            <w:proofErr w:type="spellEnd"/>
             <w:r>
               <w:rPr>
                 <w:sz w:val="18"/>
@@ -9369,7 +8900,6 @@
               <w:tc>
                 <w:tcPr>
                   <w:tcW w:w="850" w:type="dxa"/>
-                  <w:shd w:val="clear" w:color="auto" w:fill="auto"/>
                 </w:tcPr>
                 <w:p>
                   <w:pPr>
@@ -9381,7 +8911,6 @@
               <w:tc>
                 <w:tcPr>
                   <w:tcW w:w="850" w:type="dxa"/>
-                  <w:shd w:val="clear" w:color="auto" w:fill="auto"/>
                 </w:tcPr>
                 <w:p>
                   <w:pPr>
@@ -14390,6 +13919,7 @@
     <w:rsid w:val="008E34D3"/>
     <w:rsid w:val="00902319"/>
     <w:rsid w:val="009307F7"/>
+    <w:rsid w:val="009521F9"/>
     <w:rsid w:val="0099391D"/>
     <w:rsid w:val="009E2A19"/>
     <w:rsid w:val="00A8290F"/>
@@ -14400,6 +13930,7 @@
     <w:rsid w:val="00BD645D"/>
     <w:rsid w:val="00C26620"/>
     <w:rsid w:val="00D12F3B"/>
+    <w:rsid w:val="00D20346"/>
     <w:rsid w:val="00DB66B5"/>
     <w:rsid w:val="00DE2DEB"/>
     <w:rsid w:val="00EE1366"/>

</xml_diff>